<commit_message>
docs(magazine): 补齐Table 1与Table 2实体表格并更新Word审阅稿
</commit_message>
<xml_diff>
--- a/.scratch/fl-testbed-magazine-draft/prototypes/IEEE-Communications-Magazine中文初稿.docx
+++ b/.scratch/fl-testbed-magazine-draft/prototypes/IEEE-Communications-Magazine中文初稿.docx
@@ -258,6 +258,937 @@
         </w:rPr>
         <w:t>Table 1 对比常规 Wi-Fi、低功耗蓝牙、软件定义无线电与 WFB-FL 对三项核心能力的满足情况，以及硬件成本和部署、配置、运行复杂度。</w:t>
       </w:r>
+    </w:p>
+    <w:tbl>
+      <w:tblPr>
+        <w:tblW w:type="auto" w:w="0"/>
+        <w:jc w:val="center"/>
+        <w:tblLook w:firstColumn="1" w:firstRow="1" w:lastColumn="0" w:lastRow="0" w:noHBand="0" w:noVBand="1" w:val="04A0"/>
+        <w:tblBorders>
+          <w:top w:val="single" w:sz="12" w:space="0" w:color="2C3E50"/>
+          <w:bottom w:val="single" w:sz="12" w:space="0" w:color="2C3E50"/>
+          <w:left w:val="none"/>
+          <w:right w:val="none"/>
+          <w:insideH w:val="single" w:sz="4" w:space="0" w:color="D0D7DE"/>
+          <w:insideV w:val="none"/>
+        </w:tblBorders>
+      </w:tblPr>
+      <w:tblGrid>
+        <w:gridCol w:w="1806"/>
+        <w:gridCol w:w="1806"/>
+        <w:gridCol w:w="1806"/>
+        <w:gridCol w:w="1806"/>
+        <w:gridCol w:w="1806"/>
+      </w:tblGrid>
+      <w:tr>
+        <w:tc>
+          <w:tcPr>
+            <w:tcW w:type="dxa" w:w="1806"/>
+            <w:shd w:fill="EAEFF5"/>
+          </w:tcPr>
+          <w:p>
+            <w:pPr>
+              <w:spacing w:before="80" w:after="80"/>
+              <w:jc w:val="center"/>
+            </w:pPr>
+            <w:r>
+              <w:rPr>
+                <w:rFonts w:ascii="Arial" w:hAnsi="Arial" w:eastAsia="黑体"/>
+                <w:b/>
+                <w:i w:val="0"/>
+                <w:color w:val="182B49"/>
+                <w:sz w:val="19"/>
+              </w:rPr>
+              <w:t>评估维度</w:t>
+            </w:r>
+          </w:p>
+        </w:tc>
+        <w:tc>
+          <w:tcPr>
+            <w:tcW w:type="dxa" w:w="1806"/>
+            <w:shd w:fill="EAEFF5"/>
+          </w:tcPr>
+          <w:p>
+            <w:pPr>
+              <w:spacing w:before="80" w:after="80"/>
+              <w:jc w:val="center"/>
+            </w:pPr>
+            <w:r>
+              <w:rPr>
+                <w:rFonts w:ascii="Arial" w:hAnsi="Arial" w:eastAsia="黑体"/>
+                <w:b/>
+                <w:i w:val="0"/>
+                <w:color w:val="182B49"/>
+                <w:sz w:val="19"/>
+              </w:rPr>
+              <w:t>常规 Wi-Fi</w:t>
+            </w:r>
+          </w:p>
+        </w:tc>
+        <w:tc>
+          <w:tcPr>
+            <w:tcW w:type="dxa" w:w="1806"/>
+            <w:shd w:fill="EAEFF5"/>
+          </w:tcPr>
+          <w:p>
+            <w:pPr>
+              <w:spacing w:before="80" w:after="80"/>
+              <w:jc w:val="center"/>
+            </w:pPr>
+            <w:r>
+              <w:rPr>
+                <w:rFonts w:ascii="Arial" w:hAnsi="Arial" w:eastAsia="黑体"/>
+                <w:b/>
+                <w:i w:val="0"/>
+                <w:color w:val="182B49"/>
+                <w:sz w:val="19"/>
+              </w:rPr>
+              <w:t>低功耗蓝牙</w:t>
+            </w:r>
+          </w:p>
+        </w:tc>
+        <w:tc>
+          <w:tcPr>
+            <w:tcW w:type="dxa" w:w="1806"/>
+            <w:shd w:fill="EAEFF5"/>
+          </w:tcPr>
+          <w:p>
+            <w:pPr>
+              <w:spacing w:before="80" w:after="80"/>
+              <w:jc w:val="center"/>
+            </w:pPr>
+            <w:r>
+              <w:rPr>
+                <w:rFonts w:ascii="Arial" w:hAnsi="Arial" w:eastAsia="黑体"/>
+                <w:b/>
+                <w:i w:val="0"/>
+                <w:color w:val="182B49"/>
+                <w:sz w:val="19"/>
+              </w:rPr>
+              <w:t>软件定义无线电</w:t>
+            </w:r>
+          </w:p>
+        </w:tc>
+        <w:tc>
+          <w:tcPr>
+            <w:tcW w:type="dxa" w:w="1806"/>
+            <w:shd w:fill="EAEFF5"/>
+          </w:tcPr>
+          <w:p>
+            <w:pPr>
+              <w:spacing w:before="80" w:after="80"/>
+              <w:jc w:val="center"/>
+            </w:pPr>
+            <w:r>
+              <w:rPr>
+                <w:rFonts w:ascii="Arial" w:hAnsi="Arial" w:eastAsia="黑体"/>
+                <w:b/>
+                <w:i w:val="0"/>
+                <w:color w:val="182B49"/>
+                <w:sz w:val="19"/>
+              </w:rPr>
+              <w:t>本文平台（WFB-FL）</w:t>
+            </w:r>
+          </w:p>
+        </w:tc>
+      </w:tr>
+      <w:tr>
+        <w:tc>
+          <w:tcPr>
+            <w:tcW w:type="dxa" w:w="1806"/>
+          </w:tcPr>
+          <w:p>
+            <w:pPr>
+              <w:spacing w:before="60" w:after="60"/>
+              <w:jc w:val="center"/>
+            </w:pPr>
+            <w:r>
+              <w:rPr>
+                <w:rFonts w:ascii="Times New Roman" w:hAnsi="Times New Roman" w:eastAsia="宋体"/>
+                <w:b w:val="0"/>
+                <w:i w:val="0"/>
+                <w:sz w:val="19"/>
+              </w:rPr>
+              <w:t>---</w:t>
+            </w:r>
+          </w:p>
+        </w:tc>
+        <w:tc>
+          <w:tcPr>
+            <w:tcW w:type="dxa" w:w="1806"/>
+          </w:tcPr>
+          <w:p>
+            <w:pPr>
+              <w:spacing w:before="60" w:after="60"/>
+              <w:jc w:val="left"/>
+            </w:pPr>
+            <w:r>
+              <w:rPr>
+                <w:rFonts w:ascii="Times New Roman" w:hAnsi="Times New Roman" w:eastAsia="宋体"/>
+                <w:b w:val="0"/>
+                <w:i w:val="0"/>
+                <w:sz w:val="19"/>
+              </w:rPr>
+              <w:t>---</w:t>
+            </w:r>
+          </w:p>
+        </w:tc>
+        <w:tc>
+          <w:tcPr>
+            <w:tcW w:type="dxa" w:w="1806"/>
+          </w:tcPr>
+          <w:p>
+            <w:pPr>
+              <w:spacing w:before="60" w:after="60"/>
+              <w:jc w:val="left"/>
+            </w:pPr>
+            <w:r>
+              <w:rPr>
+                <w:rFonts w:ascii="Times New Roman" w:hAnsi="Times New Roman" w:eastAsia="宋体"/>
+                <w:b w:val="0"/>
+                <w:i w:val="0"/>
+                <w:sz w:val="19"/>
+              </w:rPr>
+              <w:t>---</w:t>
+            </w:r>
+          </w:p>
+        </w:tc>
+        <w:tc>
+          <w:tcPr>
+            <w:tcW w:type="dxa" w:w="1806"/>
+          </w:tcPr>
+          <w:p>
+            <w:pPr>
+              <w:spacing w:before="60" w:after="60"/>
+              <w:jc w:val="left"/>
+            </w:pPr>
+            <w:r>
+              <w:rPr>
+                <w:rFonts w:ascii="Times New Roman" w:hAnsi="Times New Roman" w:eastAsia="宋体"/>
+                <w:b w:val="0"/>
+                <w:i w:val="0"/>
+                <w:sz w:val="19"/>
+              </w:rPr>
+              <w:t>---</w:t>
+            </w:r>
+          </w:p>
+        </w:tc>
+        <w:tc>
+          <w:tcPr>
+            <w:tcW w:type="dxa" w:w="1806"/>
+          </w:tcPr>
+          <w:p>
+            <w:pPr>
+              <w:spacing w:before="60" w:after="60"/>
+              <w:jc w:val="left"/>
+            </w:pPr>
+            <w:r>
+              <w:rPr>
+                <w:rFonts w:ascii="Times New Roman" w:hAnsi="Times New Roman" w:eastAsia="宋体"/>
+                <w:b w:val="0"/>
+                <w:i w:val="0"/>
+                <w:sz w:val="19"/>
+              </w:rPr>
+              <w:t>---</w:t>
+            </w:r>
+          </w:p>
+        </w:tc>
+      </w:tr>
+      <w:tr>
+        <w:tc>
+          <w:tcPr>
+            <w:tcW w:type="dxa" w:w="1806"/>
+          </w:tcPr>
+          <w:p>
+            <w:pPr>
+              <w:spacing w:before="60" w:after="60"/>
+              <w:jc w:val="center"/>
+            </w:pPr>
+            <w:r>
+              <w:rPr>
+                <w:rFonts w:ascii="Times New Roman" w:hAnsi="Times New Roman" w:eastAsia="宋体"/>
+                <w:b/>
+                <w:i w:val="0"/>
+                <w:sz w:val="19"/>
+              </w:rPr>
+              <w:t>无线参数可控</w:t>
+            </w:r>
+          </w:p>
+        </w:tc>
+        <w:tc>
+          <w:tcPr>
+            <w:tcW w:type="dxa" w:w="1806"/>
+          </w:tcPr>
+          <w:p>
+            <w:pPr>
+              <w:spacing w:before="60" w:after="60"/>
+              <w:jc w:val="left"/>
+            </w:pPr>
+            <w:r>
+              <w:rPr>
+                <w:rFonts w:ascii="Times New Roman" w:hAnsi="Times New Roman" w:eastAsia="宋体"/>
+                <w:b/>
+                <w:i w:val="0"/>
+                <w:sz w:val="19"/>
+              </w:rPr>
+              <w:t>不可控</w:t>
+            </w:r>
+            <w:r>
+              <w:rPr>
+                <w:rFonts w:ascii="Times New Roman" w:hAnsi="Times New Roman" w:eastAsia="宋体"/>
+                <w:b w:val="0"/>
+                <w:i w:val="0"/>
+                <w:sz w:val="19"/>
+              </w:rPr>
+              <w:t>（固件黑盒封装）</w:t>
+            </w:r>
+          </w:p>
+        </w:tc>
+        <w:tc>
+          <w:tcPr>
+            <w:tcW w:type="dxa" w:w="1806"/>
+          </w:tcPr>
+          <w:p>
+            <w:pPr>
+              <w:spacing w:before="60" w:after="60"/>
+              <w:jc w:val="left"/>
+            </w:pPr>
+            <w:r>
+              <w:rPr>
+                <w:rFonts w:ascii="Times New Roman" w:hAnsi="Times New Roman" w:eastAsia="宋体"/>
+                <w:b/>
+                <w:i w:val="0"/>
+                <w:sz w:val="19"/>
+              </w:rPr>
+              <w:t>极低</w:t>
+            </w:r>
+            <w:r>
+              <w:rPr>
+                <w:rFonts w:ascii="Times New Roman" w:hAnsi="Times New Roman" w:eastAsia="宋体"/>
+                <w:b w:val="0"/>
+                <w:i w:val="0"/>
+                <w:sz w:val="19"/>
+              </w:rPr>
+              <w:t>（固件协议封装）</w:t>
+            </w:r>
+          </w:p>
+        </w:tc>
+        <w:tc>
+          <w:tcPr>
+            <w:tcW w:type="dxa" w:w="1806"/>
+          </w:tcPr>
+          <w:p>
+            <w:pPr>
+              <w:spacing w:before="60" w:after="60"/>
+              <w:jc w:val="left"/>
+            </w:pPr>
+            <w:r>
+              <w:rPr>
+                <w:rFonts w:ascii="Times New Roman" w:hAnsi="Times New Roman" w:eastAsia="宋体"/>
+                <w:b/>
+                <w:i w:val="0"/>
+                <w:sz w:val="19"/>
+              </w:rPr>
+              <w:t>支持</w:t>
+            </w:r>
+            <w:r>
+              <w:rPr>
+                <w:rFonts w:ascii="Times New Roman" w:hAnsi="Times New Roman" w:eastAsia="宋体"/>
+                <w:b w:val="0"/>
+                <w:i w:val="0"/>
+                <w:sz w:val="19"/>
+              </w:rPr>
+              <w:t>（基带软件定制）</w:t>
+            </w:r>
+          </w:p>
+        </w:tc>
+        <w:tc>
+          <w:tcPr>
+            <w:tcW w:type="dxa" w:w="1806"/>
+          </w:tcPr>
+          <w:p>
+            <w:pPr>
+              <w:spacing w:before="60" w:after="60"/>
+              <w:jc w:val="left"/>
+            </w:pPr>
+            <w:r>
+              <w:rPr>
+                <w:rFonts w:ascii="Times New Roman" w:hAnsi="Times New Roman" w:eastAsia="宋体"/>
+                <w:b/>
+                <w:i w:val="0"/>
+                <w:sz w:val="19"/>
+              </w:rPr>
+              <w:t>完全可控</w:t>
+            </w:r>
+            <w:r>
+              <w:rPr>
+                <w:rFonts w:ascii="Times New Roman" w:hAnsi="Times New Roman" w:eastAsia="宋体"/>
+                <w:b w:val="0"/>
+                <w:i w:val="0"/>
+                <w:sz w:val="19"/>
+              </w:rPr>
+              <w:t>（逐帧显式指定）</w:t>
+            </w:r>
+          </w:p>
+        </w:tc>
+      </w:tr>
+      <w:tr>
+        <w:tc>
+          <w:tcPr>
+            <w:tcW w:type="dxa" w:w="1806"/>
+          </w:tcPr>
+          <w:p>
+            <w:pPr>
+              <w:spacing w:before="60" w:after="60"/>
+              <w:jc w:val="center"/>
+            </w:pPr>
+            <w:r>
+              <w:rPr>
+                <w:rFonts w:ascii="Times New Roman" w:hAnsi="Times New Roman" w:eastAsia="宋体"/>
+                <w:b/>
+                <w:i w:val="0"/>
+                <w:sz w:val="19"/>
+              </w:rPr>
+              <w:t>高吞吐广播</w:t>
+            </w:r>
+          </w:p>
+        </w:tc>
+        <w:tc>
+          <w:tcPr>
+            <w:tcW w:type="dxa" w:w="1806"/>
+          </w:tcPr>
+          <w:p>
+            <w:pPr>
+              <w:spacing w:before="60" w:after="60"/>
+              <w:jc w:val="left"/>
+            </w:pPr>
+            <w:r>
+              <w:rPr>
+                <w:rFonts w:ascii="Times New Roman" w:hAnsi="Times New Roman" w:eastAsia="宋体"/>
+                <w:b/>
+                <w:i w:val="0"/>
+                <w:sz w:val="19"/>
+              </w:rPr>
+              <w:t>受限</w:t>
+            </w:r>
+            <w:r>
+              <w:rPr>
+                <w:rFonts w:ascii="Times New Roman" w:hAnsi="Times New Roman" w:eastAsia="宋体"/>
+                <w:b w:val="0"/>
+                <w:i w:val="0"/>
+                <w:sz w:val="19"/>
+              </w:rPr>
+              <w:t>（锁死 1 至 6 Mbps）</w:t>
+            </w:r>
+          </w:p>
+        </w:tc>
+        <w:tc>
+          <w:tcPr>
+            <w:tcW w:type="dxa" w:w="1806"/>
+          </w:tcPr>
+          <w:p>
+            <w:pPr>
+              <w:spacing w:before="60" w:after="60"/>
+              <w:jc w:val="left"/>
+            </w:pPr>
+            <w:r>
+              <w:rPr>
+                <w:rFonts w:ascii="Times New Roman" w:hAnsi="Times New Roman" w:eastAsia="宋体"/>
+                <w:b/>
+                <w:i w:val="0"/>
+                <w:sz w:val="19"/>
+              </w:rPr>
+              <w:t>极受限</w:t>
+            </w:r>
+            <w:r>
+              <w:rPr>
+                <w:rFonts w:ascii="Times New Roman" w:hAnsi="Times New Roman" w:eastAsia="宋体"/>
+                <w:b w:val="0"/>
+                <w:i w:val="0"/>
+                <w:sz w:val="19"/>
+              </w:rPr>
+              <w:t>（带宽 1 至 2 Mbps）</w:t>
+            </w:r>
+          </w:p>
+        </w:tc>
+        <w:tc>
+          <w:tcPr>
+            <w:tcW w:type="dxa" w:w="1806"/>
+          </w:tcPr>
+          <w:p>
+            <w:pPr>
+              <w:spacing w:before="60" w:after="60"/>
+              <w:jc w:val="left"/>
+            </w:pPr>
+            <w:r>
+              <w:rPr>
+                <w:rFonts w:ascii="Times New Roman" w:hAnsi="Times New Roman" w:eastAsia="宋体"/>
+                <w:b/>
+                <w:i w:val="0"/>
+                <w:sz w:val="19"/>
+              </w:rPr>
+              <w:t>需自研</w:t>
+            </w:r>
+            <w:r>
+              <w:rPr>
+                <w:rFonts w:ascii="Times New Roman" w:hAnsi="Times New Roman" w:eastAsia="宋体"/>
+                <w:b w:val="0"/>
+                <w:i w:val="0"/>
+                <w:sz w:val="19"/>
+              </w:rPr>
+              <w:t>（需重写协议栈）</w:t>
+            </w:r>
+          </w:p>
+        </w:tc>
+        <w:tc>
+          <w:tcPr>
+            <w:tcW w:type="dxa" w:w="1806"/>
+          </w:tcPr>
+          <w:p>
+            <w:pPr>
+              <w:spacing w:before="60" w:after="60"/>
+              <w:jc w:val="left"/>
+            </w:pPr>
+            <w:r>
+              <w:rPr>
+                <w:rFonts w:ascii="Times New Roman" w:hAnsi="Times New Roman" w:eastAsia="宋体"/>
+                <w:b/>
+                <w:i w:val="0"/>
+                <w:sz w:val="19"/>
+              </w:rPr>
+              <w:t>原生支持</w:t>
+            </w:r>
+            <w:r>
+              <w:rPr>
+                <w:rFonts w:ascii="Times New Roman" w:hAnsi="Times New Roman" w:eastAsia="宋体"/>
+                <w:b w:val="0"/>
+                <w:i w:val="0"/>
+                <w:sz w:val="19"/>
+              </w:rPr>
+              <w:t>（高阶速率广播）</w:t>
+            </w:r>
+          </w:p>
+        </w:tc>
+      </w:tr>
+      <w:tr>
+        <w:tc>
+          <w:tcPr>
+            <w:tcW w:type="dxa" w:w="1806"/>
+          </w:tcPr>
+          <w:p>
+            <w:pPr>
+              <w:spacing w:before="60" w:after="60"/>
+              <w:jc w:val="center"/>
+            </w:pPr>
+            <w:r>
+              <w:rPr>
+                <w:rFonts w:ascii="Times New Roman" w:hAnsi="Times New Roman" w:eastAsia="宋体"/>
+                <w:b/>
+                <w:i w:val="0"/>
+                <w:sz w:val="19"/>
+              </w:rPr>
+              <w:t>无线传输特征观测</w:t>
+            </w:r>
+          </w:p>
+        </w:tc>
+        <w:tc>
+          <w:tcPr>
+            <w:tcW w:type="dxa" w:w="1806"/>
+          </w:tcPr>
+          <w:p>
+            <w:pPr>
+              <w:spacing w:before="60" w:after="60"/>
+              <w:jc w:val="left"/>
+            </w:pPr>
+            <w:r>
+              <w:rPr>
+                <w:rFonts w:ascii="Times New Roman" w:hAnsi="Times New Roman" w:eastAsia="宋体"/>
+                <w:b/>
+                <w:i w:val="0"/>
+                <w:sz w:val="19"/>
+              </w:rPr>
+              <w:t>缺失</w:t>
+            </w:r>
+            <w:r>
+              <w:rPr>
+                <w:rFonts w:ascii="Times New Roman" w:hAnsi="Times New Roman" w:eastAsia="宋体"/>
+                <w:b w:val="0"/>
+                <w:i w:val="0"/>
+                <w:sz w:val="19"/>
+              </w:rPr>
+              <w:t>（无物理层元数据）</w:t>
+            </w:r>
+          </w:p>
+        </w:tc>
+        <w:tc>
+          <w:tcPr>
+            <w:tcW w:type="dxa" w:w="1806"/>
+          </w:tcPr>
+          <w:p>
+            <w:pPr>
+              <w:spacing w:before="60" w:after="60"/>
+              <w:jc w:val="left"/>
+            </w:pPr>
+            <w:r>
+              <w:rPr>
+                <w:rFonts w:ascii="Times New Roman" w:hAnsi="Times New Roman" w:eastAsia="宋体"/>
+                <w:b/>
+                <w:i w:val="0"/>
+                <w:sz w:val="19"/>
+              </w:rPr>
+              <w:t>缺失</w:t>
+            </w:r>
+            <w:r>
+              <w:rPr>
+                <w:rFonts w:ascii="Times New Roman" w:hAnsi="Times New Roman" w:eastAsia="宋体"/>
+                <w:b w:val="0"/>
+                <w:i w:val="0"/>
+                <w:sz w:val="19"/>
+              </w:rPr>
+              <w:t>（仅粗粒度 RSSI）</w:t>
+            </w:r>
+          </w:p>
+        </w:tc>
+        <w:tc>
+          <w:tcPr>
+            <w:tcW w:type="dxa" w:w="1806"/>
+          </w:tcPr>
+          <w:p>
+            <w:pPr>
+              <w:spacing w:before="60" w:after="60"/>
+              <w:jc w:val="left"/>
+            </w:pPr>
+            <w:r>
+              <w:rPr>
+                <w:rFonts w:ascii="Times New Roman" w:hAnsi="Times New Roman" w:eastAsia="宋体"/>
+                <w:b/>
+                <w:i w:val="0"/>
+                <w:sz w:val="19"/>
+              </w:rPr>
+              <w:t>支持</w:t>
+            </w:r>
+            <w:r>
+              <w:rPr>
+                <w:rFonts w:ascii="Times New Roman" w:hAnsi="Times New Roman" w:eastAsia="宋体"/>
+                <w:b w:val="0"/>
+                <w:i w:val="0"/>
+                <w:sz w:val="19"/>
+              </w:rPr>
+              <w:t>（需专用测量仪器）</w:t>
+            </w:r>
+          </w:p>
+        </w:tc>
+        <w:tc>
+          <w:tcPr>
+            <w:tcW w:type="dxa" w:w="1806"/>
+          </w:tcPr>
+          <w:p>
+            <w:pPr>
+              <w:spacing w:before="60" w:after="60"/>
+              <w:jc w:val="left"/>
+            </w:pPr>
+            <w:r>
+              <w:rPr>
+                <w:rFonts w:ascii="Times New Roman" w:hAnsi="Times New Roman" w:eastAsia="宋体"/>
+                <w:b/>
+                <w:i w:val="0"/>
+                <w:sz w:val="19"/>
+              </w:rPr>
+              <w:t>原生支持</w:t>
+            </w:r>
+            <w:r>
+              <w:rPr>
+                <w:rFonts w:ascii="Times New Roman" w:hAnsi="Times New Roman" w:eastAsia="宋体"/>
+                <w:b w:val="0"/>
+                <w:i w:val="0"/>
+                <w:sz w:val="19"/>
+              </w:rPr>
+              <w:t>（帧级元数据捕获）</w:t>
+            </w:r>
+          </w:p>
+        </w:tc>
+      </w:tr>
+      <w:tr>
+        <w:tc>
+          <w:tcPr>
+            <w:tcW w:type="dxa" w:w="1806"/>
+          </w:tcPr>
+          <w:p>
+            <w:pPr>
+              <w:spacing w:before="60" w:after="60"/>
+              <w:jc w:val="center"/>
+            </w:pPr>
+            <w:r>
+              <w:rPr>
+                <w:rFonts w:ascii="Times New Roman" w:hAnsi="Times New Roman" w:eastAsia="宋体"/>
+                <w:b/>
+                <w:i w:val="0"/>
+                <w:sz w:val="19"/>
+              </w:rPr>
+              <w:t>硬件成本</w:t>
+            </w:r>
+          </w:p>
+        </w:tc>
+        <w:tc>
+          <w:tcPr>
+            <w:tcW w:type="dxa" w:w="1806"/>
+          </w:tcPr>
+          <w:p>
+            <w:pPr>
+              <w:spacing w:before="60" w:after="60"/>
+              <w:jc w:val="left"/>
+            </w:pPr>
+            <w:r>
+              <w:rPr>
+                <w:rFonts w:ascii="Times New Roman" w:hAnsi="Times New Roman" w:eastAsia="宋体"/>
+                <w:b/>
+                <w:i w:val="0"/>
+                <w:sz w:val="19"/>
+              </w:rPr>
+              <w:t>低</w:t>
+            </w:r>
+            <w:r>
+              <w:rPr>
+                <w:rFonts w:ascii="Times New Roman" w:hAnsi="Times New Roman" w:eastAsia="宋体"/>
+                <w:b w:val="0"/>
+                <w:i w:val="0"/>
+                <w:sz w:val="19"/>
+              </w:rPr>
+              <w:t>（百元级）</w:t>
+            </w:r>
+          </w:p>
+        </w:tc>
+        <w:tc>
+          <w:tcPr>
+            <w:tcW w:type="dxa" w:w="1806"/>
+          </w:tcPr>
+          <w:p>
+            <w:pPr>
+              <w:spacing w:before="60" w:after="60"/>
+              <w:jc w:val="left"/>
+            </w:pPr>
+            <w:r>
+              <w:rPr>
+                <w:rFonts w:ascii="Times New Roman" w:hAnsi="Times New Roman" w:eastAsia="宋体"/>
+                <w:b/>
+                <w:i w:val="0"/>
+                <w:sz w:val="19"/>
+              </w:rPr>
+              <w:t>低</w:t>
+            </w:r>
+            <w:r>
+              <w:rPr>
+                <w:rFonts w:ascii="Times New Roman" w:hAnsi="Times New Roman" w:eastAsia="宋体"/>
+                <w:b w:val="0"/>
+                <w:i w:val="0"/>
+                <w:sz w:val="19"/>
+              </w:rPr>
+              <w:t>（数十元）</w:t>
+            </w:r>
+          </w:p>
+        </w:tc>
+        <w:tc>
+          <w:tcPr>
+            <w:tcW w:type="dxa" w:w="1806"/>
+          </w:tcPr>
+          <w:p>
+            <w:pPr>
+              <w:spacing w:before="60" w:after="60"/>
+              <w:jc w:val="left"/>
+            </w:pPr>
+            <w:r>
+              <w:rPr>
+                <w:rFonts w:ascii="Times New Roman" w:hAnsi="Times New Roman" w:eastAsia="宋体"/>
+                <w:b/>
+                <w:i w:val="0"/>
+                <w:sz w:val="19"/>
+              </w:rPr>
+              <w:t>极高</w:t>
+            </w:r>
+            <w:r>
+              <w:rPr>
+                <w:rFonts w:ascii="Times New Roman" w:hAnsi="Times New Roman" w:eastAsia="宋体"/>
+                <w:b w:val="0"/>
+                <w:i w:val="0"/>
+                <w:sz w:val="19"/>
+              </w:rPr>
+              <w:t>（单节点数万元）</w:t>
+            </w:r>
+          </w:p>
+        </w:tc>
+        <w:tc>
+          <w:tcPr>
+            <w:tcW w:type="dxa" w:w="1806"/>
+          </w:tcPr>
+          <w:p>
+            <w:pPr>
+              <w:spacing w:before="60" w:after="60"/>
+              <w:jc w:val="left"/>
+            </w:pPr>
+            <w:r>
+              <w:rPr>
+                <w:rFonts w:ascii="Times New Roman" w:hAnsi="Times New Roman" w:eastAsia="宋体"/>
+                <w:b/>
+                <w:i w:val="0"/>
+                <w:sz w:val="19"/>
+              </w:rPr>
+              <w:t>低</w:t>
+            </w:r>
+            <w:r>
+              <w:rPr>
+                <w:rFonts w:ascii="Times New Roman" w:hAnsi="Times New Roman" w:eastAsia="宋体"/>
+                <w:b w:val="0"/>
+                <w:i w:val="0"/>
+                <w:sz w:val="19"/>
+              </w:rPr>
+              <w:t>（现成消费级网卡）</w:t>
+            </w:r>
+          </w:p>
+        </w:tc>
+      </w:tr>
+      <w:tr>
+        <w:tc>
+          <w:tcPr>
+            <w:tcW w:type="dxa" w:w="1806"/>
+          </w:tcPr>
+          <w:p>
+            <w:pPr>
+              <w:spacing w:before="60" w:after="60"/>
+              <w:jc w:val="center"/>
+            </w:pPr>
+            <w:r>
+              <w:rPr>
+                <w:rFonts w:ascii="Times New Roman" w:hAnsi="Times New Roman" w:eastAsia="宋体"/>
+                <w:b/>
+                <w:i w:val="0"/>
+                <w:sz w:val="19"/>
+              </w:rPr>
+              <w:t>部署与维护门槛</w:t>
+            </w:r>
+          </w:p>
+        </w:tc>
+        <w:tc>
+          <w:tcPr>
+            <w:tcW w:type="dxa" w:w="1806"/>
+          </w:tcPr>
+          <w:p>
+            <w:pPr>
+              <w:spacing w:before="60" w:after="60"/>
+              <w:jc w:val="left"/>
+            </w:pPr>
+            <w:r>
+              <w:rPr>
+                <w:rFonts w:ascii="Times New Roman" w:hAnsi="Times New Roman" w:eastAsia="宋体"/>
+                <w:b/>
+                <w:i w:val="0"/>
+                <w:sz w:val="19"/>
+              </w:rPr>
+              <w:t>低</w:t>
+            </w:r>
+            <w:r>
+              <w:rPr>
+                <w:rFonts w:ascii="Times New Roman" w:hAnsi="Times New Roman" w:eastAsia="宋体"/>
+                <w:b w:val="0"/>
+                <w:i w:val="0"/>
+                <w:sz w:val="19"/>
+              </w:rPr>
+              <w:t>（即插即用）</w:t>
+            </w:r>
+          </w:p>
+        </w:tc>
+        <w:tc>
+          <w:tcPr>
+            <w:tcW w:type="dxa" w:w="1806"/>
+          </w:tcPr>
+          <w:p>
+            <w:pPr>
+              <w:spacing w:before="60" w:after="60"/>
+              <w:jc w:val="left"/>
+            </w:pPr>
+            <w:r>
+              <w:rPr>
+                <w:rFonts w:ascii="Times New Roman" w:hAnsi="Times New Roman" w:eastAsia="宋体"/>
+                <w:b/>
+                <w:i w:val="0"/>
+                <w:sz w:val="19"/>
+              </w:rPr>
+              <w:t>低</w:t>
+            </w:r>
+            <w:r>
+              <w:rPr>
+                <w:rFonts w:ascii="Times New Roman" w:hAnsi="Times New Roman" w:eastAsia="宋体"/>
+                <w:b w:val="0"/>
+                <w:i w:val="0"/>
+                <w:sz w:val="19"/>
+              </w:rPr>
+              <w:t>（即插即用）</w:t>
+            </w:r>
+          </w:p>
+        </w:tc>
+        <w:tc>
+          <w:tcPr>
+            <w:tcW w:type="dxa" w:w="1806"/>
+          </w:tcPr>
+          <w:p>
+            <w:pPr>
+              <w:spacing w:before="60" w:after="60"/>
+              <w:jc w:val="left"/>
+            </w:pPr>
+            <w:r>
+              <w:rPr>
+                <w:rFonts w:ascii="Times New Roman" w:hAnsi="Times New Roman" w:eastAsia="宋体"/>
+                <w:b/>
+                <w:i w:val="0"/>
+                <w:sz w:val="19"/>
+              </w:rPr>
+              <w:t>极高</w:t>
+            </w:r>
+            <w:r>
+              <w:rPr>
+                <w:rFonts w:ascii="Times New Roman" w:hAnsi="Times New Roman" w:eastAsia="宋体"/>
+                <w:b w:val="0"/>
+                <w:i w:val="0"/>
+                <w:sz w:val="19"/>
+              </w:rPr>
+              <w:t>（需许可、维护复杂）</w:t>
+            </w:r>
+          </w:p>
+        </w:tc>
+        <w:tc>
+          <w:tcPr>
+            <w:tcW w:type="dxa" w:w="1806"/>
+          </w:tcPr>
+          <w:p>
+            <w:pPr>
+              <w:spacing w:before="60" w:after="60"/>
+              <w:jc w:val="left"/>
+            </w:pPr>
+            <w:r>
+              <w:rPr>
+                <w:rFonts w:ascii="Times New Roman" w:hAnsi="Times New Roman" w:eastAsia="宋体"/>
+                <w:b/>
+                <w:i w:val="0"/>
+                <w:sz w:val="19"/>
+              </w:rPr>
+              <w:t>低</w:t>
+            </w:r>
+            <w:r>
+              <w:rPr>
+                <w:rFonts w:ascii="Times New Roman" w:hAnsi="Times New Roman" w:eastAsia="宋体"/>
+                <w:b w:val="0"/>
+                <w:i w:val="0"/>
+                <w:sz w:val="19"/>
+              </w:rPr>
+              <w:t>（免许可频段、易复现）</w:t>
+            </w:r>
+          </w:p>
+        </w:tc>
+      </w:tr>
+    </w:tbl>
+    <w:p>
+      <w:pPr>
+        <w:spacing w:after="80"/>
+      </w:pPr>
     </w:p>
     <w:p>
       <w:pPr>
@@ -667,6 +1598,1022 @@
         <w:t>Table 2 汇总六项无线参数的可配置取值和核验结果。</w:t>
       </w:r>
     </w:p>
+    <w:tbl>
+      <w:tblPr>
+        <w:tblW w:type="auto" w:w="0"/>
+        <w:jc w:val="center"/>
+        <w:tblLook w:firstColumn="1" w:firstRow="1" w:lastColumn="0" w:lastRow="0" w:noHBand="0" w:noVBand="1" w:val="04A0"/>
+        <w:tblBorders>
+          <w:top w:val="single" w:sz="12" w:space="0" w:color="2C3E50"/>
+          <w:bottom w:val="single" w:sz="12" w:space="0" w:color="2C3E50"/>
+          <w:left w:val="none"/>
+          <w:right w:val="none"/>
+          <w:insideH w:val="single" w:sz="4" w:space="0" w:color="D0D7DE"/>
+          <w:insideV w:val="none"/>
+        </w:tblBorders>
+      </w:tblPr>
+      <w:tblGrid>
+        <w:gridCol w:w="1505"/>
+        <w:gridCol w:w="1505"/>
+        <w:gridCol w:w="1505"/>
+        <w:gridCol w:w="1505"/>
+        <w:gridCol w:w="1505"/>
+        <w:gridCol w:w="1505"/>
+      </w:tblGrid>
+      <w:tr>
+        <w:tc>
+          <w:tcPr>
+            <w:tcW w:type="dxa" w:w="1505"/>
+            <w:shd w:fill="EAEFF5"/>
+          </w:tcPr>
+          <w:p>
+            <w:pPr>
+              <w:spacing w:before="80" w:after="80"/>
+              <w:jc w:val="center"/>
+            </w:pPr>
+            <w:r>
+              <w:rPr>
+                <w:rFonts w:ascii="Arial" w:hAnsi="Arial" w:eastAsia="黑体"/>
+                <w:b/>
+                <w:i w:val="0"/>
+                <w:color w:val="182B49"/>
+                <w:sz w:val="19"/>
+              </w:rPr>
+              <w:t>无线参数类别</w:t>
+            </w:r>
+          </w:p>
+        </w:tc>
+        <w:tc>
+          <w:tcPr>
+            <w:tcW w:type="dxa" w:w="1505"/>
+            <w:shd w:fill="EAEFF5"/>
+          </w:tcPr>
+          <w:p>
+            <w:pPr>
+              <w:spacing w:before="80" w:after="80"/>
+              <w:jc w:val="center"/>
+            </w:pPr>
+            <w:r>
+              <w:rPr>
+                <w:rFonts w:ascii="Arial" w:hAnsi="Arial" w:eastAsia="黑体"/>
+                <w:b/>
+                <w:i w:val="0"/>
+                <w:color w:val="182B49"/>
+                <w:sz w:val="19"/>
+              </w:rPr>
+              <w:t>设定配置范围</w:t>
+            </w:r>
+          </w:p>
+        </w:tc>
+        <w:tc>
+          <w:tcPr>
+            <w:tcW w:type="dxa" w:w="1505"/>
+            <w:shd w:fill="EAEFF5"/>
+          </w:tcPr>
+          <w:p>
+            <w:pPr>
+              <w:spacing w:before="80" w:after="80"/>
+              <w:jc w:val="center"/>
+            </w:pPr>
+            <w:r>
+              <w:rPr>
+                <w:rFonts w:ascii="Arial" w:hAnsi="Arial" w:eastAsia="黑体"/>
+                <w:b/>
+                <w:i w:val="0"/>
+                <w:color w:val="182B49"/>
+                <w:sz w:val="19"/>
+              </w:rPr>
+              <w:t>发送端注入验证</w:t>
+            </w:r>
+          </w:p>
+        </w:tc>
+        <w:tc>
+          <w:tcPr>
+            <w:tcW w:type="dxa" w:w="1505"/>
+            <w:shd w:fill="EAEFF5"/>
+          </w:tcPr>
+          <w:p>
+            <w:pPr>
+              <w:spacing w:before="80" w:after="80"/>
+              <w:jc w:val="center"/>
+            </w:pPr>
+            <w:r>
+              <w:rPr>
+                <w:rFonts w:ascii="Arial" w:hAnsi="Arial" w:eastAsia="黑体"/>
+                <w:b/>
+                <w:i w:val="0"/>
+                <w:color w:val="182B49"/>
+                <w:sz w:val="19"/>
+              </w:rPr>
+              <w:t>接收端物理观测依据</w:t>
+            </w:r>
+          </w:p>
+        </w:tc>
+        <w:tc>
+          <w:tcPr>
+            <w:tcW w:type="dxa" w:w="1505"/>
+            <w:shd w:fill="EAEFF5"/>
+          </w:tcPr>
+          <w:p>
+            <w:pPr>
+              <w:spacing w:before="80" w:after="80"/>
+              <w:jc w:val="center"/>
+            </w:pPr>
+            <w:r>
+              <w:rPr>
+                <w:rFonts w:ascii="Arial" w:hAnsi="Arial" w:eastAsia="黑体"/>
+                <w:b/>
+                <w:i w:val="0"/>
+                <w:color w:val="182B49"/>
+                <w:sz w:val="19"/>
+              </w:rPr>
+              <w:t>实验核验结果</w:t>
+            </w:r>
+          </w:p>
+        </w:tc>
+        <w:tc>
+          <w:tcPr>
+            <w:tcW w:type="dxa" w:w="1505"/>
+            <w:shd w:fill="EAEFF5"/>
+          </w:tcPr>
+          <w:p>
+            <w:pPr>
+              <w:spacing w:before="80" w:after="80"/>
+              <w:jc w:val="center"/>
+            </w:pPr>
+            <w:r>
+              <w:rPr>
+                <w:rFonts w:ascii="Arial" w:hAnsi="Arial" w:eastAsia="黑体"/>
+                <w:b/>
+                <w:i w:val="0"/>
+                <w:color w:val="182B49"/>
+                <w:sz w:val="19"/>
+              </w:rPr>
+              <w:t>硬件与环境适用边界</w:t>
+            </w:r>
+          </w:p>
+        </w:tc>
+      </w:tr>
+      <w:tr>
+        <w:tc>
+          <w:tcPr>
+            <w:tcW w:type="dxa" w:w="1505"/>
+          </w:tcPr>
+          <w:p>
+            <w:pPr>
+              <w:spacing w:before="60" w:after="60"/>
+              <w:jc w:val="center"/>
+            </w:pPr>
+            <w:r>
+              <w:rPr>
+                <w:rFonts w:ascii="Times New Roman" w:hAnsi="Times New Roman" w:eastAsia="宋体"/>
+                <w:b w:val="0"/>
+                <w:i w:val="0"/>
+                <w:sz w:val="19"/>
+              </w:rPr>
+              <w:t>---</w:t>
+            </w:r>
+          </w:p>
+        </w:tc>
+        <w:tc>
+          <w:tcPr>
+            <w:tcW w:type="dxa" w:w="1505"/>
+          </w:tcPr>
+          <w:p>
+            <w:pPr>
+              <w:spacing w:before="60" w:after="60"/>
+              <w:jc w:val="left"/>
+            </w:pPr>
+            <w:r>
+              <w:rPr>
+                <w:rFonts w:ascii="Times New Roman" w:hAnsi="Times New Roman" w:eastAsia="宋体"/>
+                <w:b w:val="0"/>
+                <w:i w:val="0"/>
+                <w:sz w:val="19"/>
+              </w:rPr>
+              <w:t>---</w:t>
+            </w:r>
+          </w:p>
+        </w:tc>
+        <w:tc>
+          <w:tcPr>
+            <w:tcW w:type="dxa" w:w="1505"/>
+          </w:tcPr>
+          <w:p>
+            <w:pPr>
+              <w:spacing w:before="60" w:after="60"/>
+              <w:jc w:val="left"/>
+            </w:pPr>
+            <w:r>
+              <w:rPr>
+                <w:rFonts w:ascii="Times New Roman" w:hAnsi="Times New Roman" w:eastAsia="宋体"/>
+                <w:b w:val="0"/>
+                <w:i w:val="0"/>
+                <w:sz w:val="19"/>
+              </w:rPr>
+              <w:t>---</w:t>
+            </w:r>
+          </w:p>
+        </w:tc>
+        <w:tc>
+          <w:tcPr>
+            <w:tcW w:type="dxa" w:w="1505"/>
+          </w:tcPr>
+          <w:p>
+            <w:pPr>
+              <w:spacing w:before="60" w:after="60"/>
+              <w:jc w:val="left"/>
+            </w:pPr>
+            <w:r>
+              <w:rPr>
+                <w:rFonts w:ascii="Times New Roman" w:hAnsi="Times New Roman" w:eastAsia="宋体"/>
+                <w:b w:val="0"/>
+                <w:i w:val="0"/>
+                <w:sz w:val="19"/>
+              </w:rPr>
+              <w:t>---</w:t>
+            </w:r>
+          </w:p>
+        </w:tc>
+        <w:tc>
+          <w:tcPr>
+            <w:tcW w:type="dxa" w:w="1505"/>
+          </w:tcPr>
+          <w:p>
+            <w:pPr>
+              <w:spacing w:before="60" w:after="60"/>
+              <w:jc w:val="left"/>
+            </w:pPr>
+            <w:r>
+              <w:rPr>
+                <w:rFonts w:ascii="Times New Roman" w:hAnsi="Times New Roman" w:eastAsia="宋体"/>
+                <w:b w:val="0"/>
+                <w:i w:val="0"/>
+                <w:sz w:val="19"/>
+              </w:rPr>
+              <w:t>---</w:t>
+            </w:r>
+          </w:p>
+        </w:tc>
+        <w:tc>
+          <w:tcPr>
+            <w:tcW w:type="dxa" w:w="1505"/>
+          </w:tcPr>
+          <w:p>
+            <w:pPr>
+              <w:spacing w:before="60" w:after="60"/>
+              <w:jc w:val="left"/>
+            </w:pPr>
+            <w:r>
+              <w:rPr>
+                <w:rFonts w:ascii="Times New Roman" w:hAnsi="Times New Roman" w:eastAsia="宋体"/>
+                <w:b w:val="0"/>
+                <w:i w:val="0"/>
+                <w:sz w:val="19"/>
+              </w:rPr>
+              <w:t>---</w:t>
+            </w:r>
+          </w:p>
+        </w:tc>
+      </w:tr>
+      <w:tr>
+        <w:tc>
+          <w:tcPr>
+            <w:tcW w:type="dxa" w:w="1505"/>
+          </w:tcPr>
+          <w:p>
+            <w:pPr>
+              <w:spacing w:before="60" w:after="60"/>
+              <w:jc w:val="center"/>
+            </w:pPr>
+            <w:r>
+              <w:rPr>
+                <w:rFonts w:ascii="Times New Roman" w:hAnsi="Times New Roman" w:eastAsia="宋体"/>
+                <w:b/>
+                <w:i w:val="0"/>
+                <w:sz w:val="19"/>
+              </w:rPr>
+              <w:t>工作信道</w:t>
+            </w:r>
+          </w:p>
+        </w:tc>
+        <w:tc>
+          <w:tcPr>
+            <w:tcW w:type="dxa" w:w="1505"/>
+          </w:tcPr>
+          <w:p>
+            <w:pPr>
+              <w:spacing w:before="60" w:after="60"/>
+              <w:jc w:val="left"/>
+            </w:pPr>
+            <w:r>
+              <w:rPr>
+                <w:rFonts w:ascii="Times New Roman" w:hAnsi="Times New Roman" w:eastAsia="宋体"/>
+                <w:b w:val="0"/>
+                <w:i w:val="0"/>
+                <w:sz w:val="19"/>
+              </w:rPr>
+              <w:t>2.4 GHz / 5 GHz（如 Ch 157）</w:t>
+            </w:r>
+          </w:p>
+        </w:tc>
+        <w:tc>
+          <w:tcPr>
+            <w:tcW w:type="dxa" w:w="1505"/>
+          </w:tcPr>
+          <w:p>
+            <w:pPr>
+              <w:spacing w:before="60" w:after="60"/>
+              <w:jc w:val="left"/>
+            </w:pPr>
+            <w:r>
+              <w:rPr>
+                <w:rFonts w:ascii="Times New Roman" w:hAnsi="Times New Roman" w:eastAsia="宋体"/>
+                <w:b w:val="0"/>
+                <w:i w:val="0"/>
+                <w:sz w:val="19"/>
+              </w:rPr>
+              <w:t>Radiotap 信道字段匹配</w:t>
+            </w:r>
+          </w:p>
+        </w:tc>
+        <w:tc>
+          <w:tcPr>
+            <w:tcW w:type="dxa" w:w="1505"/>
+          </w:tcPr>
+          <w:p>
+            <w:pPr>
+              <w:spacing w:before="60" w:after="60"/>
+              <w:jc w:val="left"/>
+            </w:pPr>
+            <w:r>
+              <w:rPr>
+                <w:rFonts w:ascii="Times New Roman" w:hAnsi="Times New Roman" w:eastAsia="宋体"/>
+                <w:b w:val="0"/>
+                <w:i w:val="0"/>
+                <w:sz w:val="19"/>
+              </w:rPr>
+              <w:t>对端捕获频率精确对应</w:t>
+            </w:r>
+          </w:p>
+        </w:tc>
+        <w:tc>
+          <w:tcPr>
+            <w:tcW w:type="dxa" w:w="1505"/>
+          </w:tcPr>
+          <w:p>
+            <w:pPr>
+              <w:spacing w:before="60" w:after="60"/>
+              <w:jc w:val="left"/>
+            </w:pPr>
+            <w:r>
+              <w:rPr>
+                <w:rFonts w:ascii="Times New Roman" w:hAnsi="Times New Roman" w:eastAsia="宋体"/>
+                <w:b w:val="0"/>
+                <w:i w:val="0"/>
+                <w:sz w:val="19"/>
+              </w:rPr>
+              <w:t>生效（100% 吻合）</w:t>
+            </w:r>
+          </w:p>
+        </w:tc>
+        <w:tc>
+          <w:tcPr>
+            <w:tcW w:type="dxa" w:w="1505"/>
+          </w:tcPr>
+          <w:p>
+            <w:pPr>
+              <w:spacing w:before="60" w:after="60"/>
+              <w:jc w:val="left"/>
+            </w:pPr>
+            <w:r>
+              <w:rPr>
+                <w:rFonts w:ascii="Times New Roman" w:hAnsi="Times New Roman" w:eastAsia="宋体"/>
+                <w:b w:val="0"/>
+                <w:i w:val="0"/>
+                <w:sz w:val="19"/>
+              </w:rPr>
+              <w:t>受国家无线电监管频段约束</w:t>
+            </w:r>
+          </w:p>
+        </w:tc>
+      </w:tr>
+      <w:tr>
+        <w:tc>
+          <w:tcPr>
+            <w:tcW w:type="dxa" w:w="1505"/>
+          </w:tcPr>
+          <w:p>
+            <w:pPr>
+              <w:spacing w:before="60" w:after="60"/>
+              <w:jc w:val="center"/>
+            </w:pPr>
+            <w:r>
+              <w:rPr>
+                <w:rFonts w:ascii="Times New Roman" w:hAnsi="Times New Roman" w:eastAsia="宋体"/>
+                <w:b/>
+                <w:i w:val="0"/>
+                <w:sz w:val="19"/>
+              </w:rPr>
+              <w:t>信道带宽</w:t>
+            </w:r>
+          </w:p>
+        </w:tc>
+        <w:tc>
+          <w:tcPr>
+            <w:tcW w:type="dxa" w:w="1505"/>
+          </w:tcPr>
+          <w:p>
+            <w:pPr>
+              <w:spacing w:before="60" w:after="60"/>
+              <w:jc w:val="left"/>
+            </w:pPr>
+            <w:r>
+              <w:rPr>
+                <w:rFonts w:ascii="Times New Roman" w:hAnsi="Times New Roman" w:eastAsia="宋体"/>
+                <w:b w:val="0"/>
+                <w:i w:val="0"/>
+                <w:sz w:val="19"/>
+              </w:rPr>
+              <w:t>20 MHz / 40 MHz</w:t>
+            </w:r>
+          </w:p>
+        </w:tc>
+        <w:tc>
+          <w:tcPr>
+            <w:tcW w:type="dxa" w:w="1505"/>
+          </w:tcPr>
+          <w:p>
+            <w:pPr>
+              <w:spacing w:before="60" w:after="60"/>
+              <w:jc w:val="left"/>
+            </w:pPr>
+            <w:r>
+              <w:rPr>
+                <w:rFonts w:ascii="Times New Roman" w:hAnsi="Times New Roman" w:eastAsia="宋体"/>
+                <w:b w:val="0"/>
+                <w:i w:val="0"/>
+                <w:sz w:val="19"/>
+              </w:rPr>
+              <w:t>Radiotap 带宽标志位填充</w:t>
+            </w:r>
+          </w:p>
+        </w:tc>
+        <w:tc>
+          <w:tcPr>
+            <w:tcW w:type="dxa" w:w="1505"/>
+          </w:tcPr>
+          <w:p>
+            <w:pPr>
+              <w:spacing w:before="60" w:after="60"/>
+              <w:jc w:val="left"/>
+            </w:pPr>
+            <w:r>
+              <w:rPr>
+                <w:rFonts w:ascii="Times New Roman" w:hAnsi="Times New Roman" w:eastAsia="宋体"/>
+                <w:b w:val="0"/>
+                <w:i w:val="0"/>
+                <w:sz w:val="19"/>
+              </w:rPr>
+              <w:t>对端捕获带宽正确识别</w:t>
+            </w:r>
+          </w:p>
+        </w:tc>
+        <w:tc>
+          <w:tcPr>
+            <w:tcW w:type="dxa" w:w="1505"/>
+          </w:tcPr>
+          <w:p>
+            <w:pPr>
+              <w:spacing w:before="60" w:after="60"/>
+              <w:jc w:val="left"/>
+            </w:pPr>
+            <w:r>
+              <w:rPr>
+                <w:rFonts w:ascii="Times New Roman" w:hAnsi="Times New Roman" w:eastAsia="宋体"/>
+                <w:b w:val="0"/>
+                <w:i w:val="0"/>
+                <w:sz w:val="19"/>
+              </w:rPr>
+              <w:t>生效（100% 吻合）</w:t>
+            </w:r>
+          </w:p>
+        </w:tc>
+        <w:tc>
+          <w:tcPr>
+            <w:tcW w:type="dxa" w:w="1505"/>
+          </w:tcPr>
+          <w:p>
+            <w:pPr>
+              <w:spacing w:before="60" w:after="60"/>
+              <w:jc w:val="left"/>
+            </w:pPr>
+            <w:r>
+              <w:rPr>
+                <w:rFonts w:ascii="Times New Roman" w:hAnsi="Times New Roman" w:eastAsia="宋体"/>
+                <w:b w:val="0"/>
+                <w:i w:val="0"/>
+                <w:sz w:val="19"/>
+              </w:rPr>
+              <w:t>依赖网卡射频与驱动支持</w:t>
+            </w:r>
+          </w:p>
+        </w:tc>
+      </w:tr>
+      <w:tr>
+        <w:tc>
+          <w:tcPr>
+            <w:tcW w:type="dxa" w:w="1505"/>
+          </w:tcPr>
+          <w:p>
+            <w:pPr>
+              <w:spacing w:before="60" w:after="60"/>
+              <w:jc w:val="center"/>
+            </w:pPr>
+            <w:r>
+              <w:rPr>
+                <w:rFonts w:ascii="Times New Roman" w:hAnsi="Times New Roman" w:eastAsia="宋体"/>
+                <w:b/>
+                <w:i w:val="0"/>
+                <w:sz w:val="19"/>
+              </w:rPr>
+              <w:t>调制编码（MCS）</w:t>
+            </w:r>
+          </w:p>
+        </w:tc>
+        <w:tc>
+          <w:tcPr>
+            <w:tcW w:type="dxa" w:w="1505"/>
+          </w:tcPr>
+          <w:p>
+            <w:pPr>
+              <w:spacing w:before="60" w:after="60"/>
+              <w:jc w:val="left"/>
+            </w:pPr>
+            <w:r>
+              <w:rPr>
+                <w:rFonts w:ascii="Times New Roman" w:hAnsi="Times New Roman" w:eastAsia="宋体"/>
+                <w:b w:val="0"/>
+                <w:i w:val="0"/>
+                <w:sz w:val="19"/>
+              </w:rPr>
+              <w:t>MCS 0 至 MCS 7（802.11n）</w:t>
+            </w:r>
+          </w:p>
+        </w:tc>
+        <w:tc>
+          <w:tcPr>
+            <w:tcW w:type="dxa" w:w="1505"/>
+          </w:tcPr>
+          <w:p>
+            <w:pPr>
+              <w:spacing w:before="60" w:after="60"/>
+              <w:jc w:val="left"/>
+            </w:pPr>
+            <w:r>
+              <w:rPr>
+                <w:rFonts w:ascii="Times New Roman" w:hAnsi="Times New Roman" w:eastAsia="宋体"/>
+                <w:b w:val="0"/>
+                <w:i w:val="0"/>
+                <w:sz w:val="19"/>
+              </w:rPr>
+              <w:t>Radiotap MCS 索引注入</w:t>
+            </w:r>
+          </w:p>
+        </w:tc>
+        <w:tc>
+          <w:tcPr>
+            <w:tcW w:type="dxa" w:w="1505"/>
+          </w:tcPr>
+          <w:p>
+            <w:pPr>
+              <w:spacing w:before="60" w:after="60"/>
+              <w:jc w:val="left"/>
+            </w:pPr>
+            <w:r>
+              <w:rPr>
+                <w:rFonts w:ascii="Times New Roman" w:hAnsi="Times New Roman" w:eastAsia="宋体"/>
+                <w:b w:val="0"/>
+                <w:i w:val="0"/>
+                <w:sz w:val="19"/>
+              </w:rPr>
+              <w:t>对端捕获 MCS 字段吻合</w:t>
+            </w:r>
+          </w:p>
+        </w:tc>
+        <w:tc>
+          <w:tcPr>
+            <w:tcW w:type="dxa" w:w="1505"/>
+          </w:tcPr>
+          <w:p>
+            <w:pPr>
+              <w:spacing w:before="60" w:after="60"/>
+              <w:jc w:val="left"/>
+            </w:pPr>
+            <w:r>
+              <w:rPr>
+                <w:rFonts w:ascii="Times New Roman" w:hAnsi="Times New Roman" w:eastAsia="宋体"/>
+                <w:b w:val="0"/>
+                <w:i w:val="0"/>
+                <w:sz w:val="19"/>
+              </w:rPr>
+              <w:t>生效（100% 吻合）</w:t>
+            </w:r>
+          </w:p>
+        </w:tc>
+        <w:tc>
+          <w:tcPr>
+            <w:tcW w:type="dxa" w:w="1505"/>
+          </w:tcPr>
+          <w:p>
+            <w:pPr>
+              <w:spacing w:before="60" w:after="60"/>
+              <w:jc w:val="left"/>
+            </w:pPr>
+            <w:r>
+              <w:rPr>
+                <w:rFonts w:ascii="Times New Roman" w:hAnsi="Times New Roman" w:eastAsia="宋体"/>
+                <w:b w:val="0"/>
+                <w:i w:val="0"/>
+                <w:sz w:val="19"/>
+              </w:rPr>
+              <w:t>依赖所选 802.11 芯片能力</w:t>
+            </w:r>
+          </w:p>
+        </w:tc>
+      </w:tr>
+      <w:tr>
+        <w:tc>
+          <w:tcPr>
+            <w:tcW w:type="dxa" w:w="1505"/>
+          </w:tcPr>
+          <w:p>
+            <w:pPr>
+              <w:spacing w:before="60" w:after="60"/>
+              <w:jc w:val="center"/>
+            </w:pPr>
+            <w:r>
+              <w:rPr>
+                <w:rFonts w:ascii="Times New Roman" w:hAnsi="Times New Roman" w:eastAsia="宋体"/>
+                <w:b/>
+                <w:i w:val="0"/>
+                <w:sz w:val="19"/>
+              </w:rPr>
+              <w:t>保护间隔（GI）</w:t>
+            </w:r>
+          </w:p>
+        </w:tc>
+        <w:tc>
+          <w:tcPr>
+            <w:tcW w:type="dxa" w:w="1505"/>
+          </w:tcPr>
+          <w:p>
+            <w:pPr>
+              <w:spacing w:before="60" w:after="60"/>
+              <w:jc w:val="left"/>
+            </w:pPr>
+            <w:r>
+              <w:rPr>
+                <w:rFonts w:ascii="Times New Roman" w:hAnsi="Times New Roman" w:eastAsia="宋体"/>
+                <w:b w:val="0"/>
+                <w:i w:val="0"/>
+                <w:sz w:val="19"/>
+              </w:rPr>
+              <w:t>Short GI（400 ns）/ Long GI</w:t>
+            </w:r>
+          </w:p>
+        </w:tc>
+        <w:tc>
+          <w:tcPr>
+            <w:tcW w:type="dxa" w:w="1505"/>
+          </w:tcPr>
+          <w:p>
+            <w:pPr>
+              <w:spacing w:before="60" w:after="60"/>
+              <w:jc w:val="left"/>
+            </w:pPr>
+            <w:r>
+              <w:rPr>
+                <w:rFonts w:ascii="Times New Roman" w:hAnsi="Times New Roman" w:eastAsia="宋体"/>
+                <w:b w:val="0"/>
+                <w:i w:val="0"/>
+                <w:sz w:val="19"/>
+              </w:rPr>
+              <w:t>Radiotap GI 标志位设置</w:t>
+            </w:r>
+          </w:p>
+        </w:tc>
+        <w:tc>
+          <w:tcPr>
+            <w:tcW w:type="dxa" w:w="1505"/>
+          </w:tcPr>
+          <w:p>
+            <w:pPr>
+              <w:spacing w:before="60" w:after="60"/>
+              <w:jc w:val="left"/>
+            </w:pPr>
+            <w:r>
+              <w:rPr>
+                <w:rFonts w:ascii="Times New Roman" w:hAnsi="Times New Roman" w:eastAsia="宋体"/>
+                <w:b w:val="0"/>
+                <w:i w:val="0"/>
+                <w:sz w:val="19"/>
+              </w:rPr>
+              <w:t>对端物理时序特征推断</w:t>
+            </w:r>
+          </w:p>
+        </w:tc>
+        <w:tc>
+          <w:tcPr>
+            <w:tcW w:type="dxa" w:w="1505"/>
+          </w:tcPr>
+          <w:p>
+            <w:pPr>
+              <w:spacing w:before="60" w:after="60"/>
+              <w:jc w:val="left"/>
+            </w:pPr>
+            <w:r>
+              <w:rPr>
+                <w:rFonts w:ascii="Times New Roman" w:hAnsi="Times New Roman" w:eastAsia="宋体"/>
+                <w:b w:val="0"/>
+                <w:i w:val="0"/>
+                <w:sz w:val="19"/>
+              </w:rPr>
+              <w:t>生效（100% 吻合）</w:t>
+            </w:r>
+          </w:p>
+        </w:tc>
+        <w:tc>
+          <w:tcPr>
+            <w:tcW w:type="dxa" w:w="1505"/>
+          </w:tcPr>
+          <w:p>
+            <w:pPr>
+              <w:spacing w:before="60" w:after="60"/>
+              <w:jc w:val="left"/>
+            </w:pPr>
+            <w:r>
+              <w:rPr>
+                <w:rFonts w:ascii="Times New Roman" w:hAnsi="Times New Roman" w:eastAsia="宋体"/>
+                <w:b w:val="0"/>
+                <w:i w:val="0"/>
+                <w:sz w:val="19"/>
+              </w:rPr>
+              <w:t>需信道多径时延扩展允许</w:t>
+            </w:r>
+          </w:p>
+        </w:tc>
+      </w:tr>
+      <w:tr>
+        <w:tc>
+          <w:tcPr>
+            <w:tcW w:type="dxa" w:w="1505"/>
+          </w:tcPr>
+          <w:p>
+            <w:pPr>
+              <w:spacing w:before="60" w:after="60"/>
+              <w:jc w:val="center"/>
+            </w:pPr>
+            <w:r>
+              <w:rPr>
+                <w:rFonts w:ascii="Times New Roman" w:hAnsi="Times New Roman" w:eastAsia="宋体"/>
+                <w:b/>
+                <w:i w:val="0"/>
+                <w:sz w:val="19"/>
+              </w:rPr>
+              <w:t>前向纠错（FEC）</w:t>
+            </w:r>
+          </w:p>
+        </w:tc>
+        <w:tc>
+          <w:tcPr>
+            <w:tcW w:type="dxa" w:w="1505"/>
+          </w:tcPr>
+          <w:p>
+            <w:pPr>
+              <w:spacing w:before="60" w:after="60"/>
+              <w:jc w:val="left"/>
+            </w:pPr>
+            <w:r>
+              <w:rPr>
+                <w:rFonts w:ascii="Times New Roman" w:hAnsi="Times New Roman" w:eastAsia="宋体"/>
+                <w:b w:val="0"/>
+                <w:i w:val="0"/>
+                <w:sz w:val="19"/>
+              </w:rPr>
+              <w:t>RS(8, 9) 至 RS(8, 12) 冗余</w:t>
+            </w:r>
+          </w:p>
+        </w:tc>
+        <w:tc>
+          <w:tcPr>
+            <w:tcW w:type="dxa" w:w="1505"/>
+          </w:tcPr>
+          <w:p>
+            <w:pPr>
+              <w:spacing w:before="60" w:after="60"/>
+              <w:jc w:val="left"/>
+            </w:pPr>
+            <w:r>
+              <w:rPr>
+                <w:rFonts w:ascii="Times New Roman" w:hAnsi="Times New Roman" w:eastAsia="宋体"/>
+                <w:b w:val="0"/>
+                <w:i w:val="0"/>
+                <w:sz w:val="19"/>
+              </w:rPr>
+              <w:t>链路控制层 Block 编号携带</w:t>
+            </w:r>
+          </w:p>
+        </w:tc>
+        <w:tc>
+          <w:tcPr>
+            <w:tcW w:type="dxa" w:w="1505"/>
+          </w:tcPr>
+          <w:p>
+            <w:pPr>
+              <w:spacing w:before="60" w:after="60"/>
+              <w:jc w:val="left"/>
+            </w:pPr>
+            <w:r>
+              <w:rPr>
+                <w:rFonts w:ascii="Times New Roman" w:hAnsi="Times New Roman" w:eastAsia="宋体"/>
+                <w:b w:val="0"/>
+                <w:i w:val="0"/>
+                <w:sz w:val="19"/>
+              </w:rPr>
+              <w:t>接收端乱序与恢复统计</w:t>
+            </w:r>
+          </w:p>
+        </w:tc>
+        <w:tc>
+          <w:tcPr>
+            <w:tcW w:type="dxa" w:w="1505"/>
+          </w:tcPr>
+          <w:p>
+            <w:pPr>
+              <w:spacing w:before="60" w:after="60"/>
+              <w:jc w:val="left"/>
+            </w:pPr>
+            <w:r>
+              <w:rPr>
+                <w:rFonts w:ascii="Times New Roman" w:hAnsi="Times New Roman" w:eastAsia="宋体"/>
+                <w:b w:val="0"/>
+                <w:i w:val="0"/>
+                <w:sz w:val="19"/>
+              </w:rPr>
+              <w:t>生效（100% 恢复）</w:t>
+            </w:r>
+          </w:p>
+        </w:tc>
+        <w:tc>
+          <w:tcPr>
+            <w:tcW w:type="dxa" w:w="1505"/>
+          </w:tcPr>
+          <w:p>
+            <w:pPr>
+              <w:spacing w:before="60" w:after="60"/>
+              <w:jc w:val="left"/>
+            </w:pPr>
+            <w:r>
+              <w:rPr>
+                <w:rFonts w:ascii="Times New Roman" w:hAnsi="Times New Roman" w:eastAsia="宋体"/>
+                <w:b w:val="0"/>
+                <w:i w:val="0"/>
+                <w:sz w:val="19"/>
+              </w:rPr>
+              <w:t>受节点 CPU 编解码算力约束</w:t>
+            </w:r>
+          </w:p>
+        </w:tc>
+      </w:tr>
+      <w:tr>
+        <w:tc>
+          <w:tcPr>
+            <w:tcW w:type="dxa" w:w="1505"/>
+          </w:tcPr>
+          <w:p>
+            <w:pPr>
+              <w:spacing w:before="60" w:after="60"/>
+              <w:jc w:val="center"/>
+            </w:pPr>
+            <w:r>
+              <w:rPr>
+                <w:rFonts w:ascii="Times New Roman" w:hAnsi="Times New Roman" w:eastAsia="宋体"/>
+                <w:b/>
+                <w:i w:val="0"/>
+                <w:sz w:val="19"/>
+              </w:rPr>
+              <w:t>发射功率</w:t>
+            </w:r>
+          </w:p>
+        </w:tc>
+        <w:tc>
+          <w:tcPr>
+            <w:tcW w:type="dxa" w:w="1505"/>
+          </w:tcPr>
+          <w:p>
+            <w:pPr>
+              <w:spacing w:before="60" w:after="60"/>
+              <w:jc w:val="left"/>
+            </w:pPr>
+            <w:r>
+              <w:rPr>
+                <w:rFonts w:ascii="Times New Roman" w:hAnsi="Times New Roman" w:eastAsia="宋体"/>
+                <w:b w:val="0"/>
+                <w:i w:val="0"/>
+                <w:sz w:val="19"/>
+              </w:rPr>
+              <w:t>10 dBm 至 20 dBm</w:t>
+            </w:r>
+          </w:p>
+        </w:tc>
+        <w:tc>
+          <w:tcPr>
+            <w:tcW w:type="dxa" w:w="1505"/>
+          </w:tcPr>
+          <w:p>
+            <w:pPr>
+              <w:spacing w:before="60" w:after="60"/>
+              <w:jc w:val="left"/>
+            </w:pPr>
+            <w:r>
+              <w:rPr>
+                <w:rFonts w:ascii="Times New Roman" w:hAnsi="Times New Roman" w:eastAsia="宋体"/>
+                <w:b w:val="0"/>
+                <w:i w:val="0"/>
+                <w:sz w:val="19"/>
+              </w:rPr>
+              <w:t>驱动与内核接口显式调用</w:t>
+            </w:r>
+          </w:p>
+        </w:tc>
+        <w:tc>
+          <w:tcPr>
+            <w:tcW w:type="dxa" w:w="1505"/>
+          </w:tcPr>
+          <w:p>
+            <w:pPr>
+              <w:spacing w:before="60" w:after="60"/>
+              <w:jc w:val="left"/>
+            </w:pPr>
+            <w:r>
+              <w:rPr>
+                <w:rFonts w:ascii="Times New Roman" w:hAnsi="Times New Roman" w:eastAsia="宋体"/>
+                <w:b w:val="0"/>
+                <w:i w:val="0"/>
+                <w:sz w:val="19"/>
+              </w:rPr>
+              <w:t>对端信号强度阶梯响应</w:t>
+            </w:r>
+          </w:p>
+        </w:tc>
+        <w:tc>
+          <w:tcPr>
+            <w:tcW w:type="dxa" w:w="1505"/>
+          </w:tcPr>
+          <w:p>
+            <w:pPr>
+              <w:spacing w:before="60" w:after="60"/>
+              <w:jc w:val="left"/>
+            </w:pPr>
+            <w:r>
+              <w:rPr>
+                <w:rFonts w:ascii="Times New Roman" w:hAnsi="Times New Roman" w:eastAsia="宋体"/>
+                <w:b w:val="0"/>
+                <w:i w:val="0"/>
+                <w:sz w:val="19"/>
+              </w:rPr>
+              <w:t>生效（阶梯一致）</w:t>
+            </w:r>
+          </w:p>
+        </w:tc>
+        <w:tc>
+          <w:tcPr>
+            <w:tcW w:type="dxa" w:w="1505"/>
+          </w:tcPr>
+          <w:p>
+            <w:pPr>
+              <w:spacing w:before="60" w:after="60"/>
+              <w:jc w:val="left"/>
+            </w:pPr>
+            <w:r>
+              <w:rPr>
+                <w:rFonts w:ascii="Times New Roman" w:hAnsi="Times New Roman" w:eastAsia="宋体"/>
+                <w:b w:val="0"/>
+                <w:i w:val="0"/>
+                <w:sz w:val="19"/>
+              </w:rPr>
+              <w:t>受驱动固件 API 支持范围约束</w:t>
+            </w:r>
+          </w:p>
+        </w:tc>
+      </w:tr>
+    </w:tbl>
+    <w:p>
+      <w:pPr>
+        <w:spacing w:after="80"/>
+      </w:pPr>
+    </w:p>
     <w:p>
       <w:pPr>
         <w:keepNext/>

</xml_diff>